<commit_message>
docs: sync legal wiki and regenerate reviewed policy and regulation drafts
</commit_message>
<xml_diff>
--- a/docs/Политика_конфиденциальности_ИС_Чат-бот_MAX.docx
+++ b/docs/Политика_конфиденциальности_ИС_Чат-бот_MAX.docx
@@ -212,22 +212,22 @@
           <w:sz w:val="28"/>
           <w:szCs w:val="28"/>
         </w:rPr>
-        <w:t xml:space="preserve">5. Чат-бот предназначен для обратной связи о вопросах местного значения. Пользователь также может обратиться в Администрацию письменно, через электронную приемную (https://elizovomr.ru/internet-priiemnaia/) либо на личном приеме. Поступившие сообщения рассматриваются с учетом их содержания и требований законодательства.</w:t>
-      </w:r>
-    </w:p>
-    <w:p>
-      <w:pPr>
-        <w:spacing w:after="0" w:line="240" w:lineRule="auto"/>
-        <w:ind w:firstLine="709"/>
-        <w:jc w:val="both"/>
-      </w:pPr>
-      <w:r>
-        <w:rPr>
-          <w:rFonts w:ascii="Times New Roman" w:cs="Times New Roman" w:eastAsia="Times New Roman" w:hAnsi="Times New Roman"/>
-          <w:sz w:val="28"/>
-          <w:szCs w:val="28"/>
-        </w:rPr>
-        <w:t xml:space="preserve">6. Чат-бот не запрашивает биометрические данные и специальные категории персональных данных. Фотографии и видеозаписи не используются для установления личности по биометрическим признакам. Пользователю рекомендуется не направлять такие сведения. При их непреднамеренном поступлении Администрация ограничивает доступ к ним и рассматривает вопрос о прекращении обработки и уничтожении с учетом требований законодательства и фактических возможностей используемых систем.</w:t>
+        <w:t xml:space="preserve">5. Чат-бот предназначен для обратной связи о вопросах местного значения. Пользователь также может обратиться в Администрацию письменно, через электронную приемную (https://elizovomr.ru/internet-priiemnaia/) либо на личном приеме. Поступившие сообщения рассматриваются с учетом их содержания и требований законодательства. Квалификация каждого сообщения по Федеральному закону от 02.05.2006 № 59-ФЗ определяется уполномоченным должностным лицом с учетом предусмотренных законом каналов, идентификации и (или) аутентификации. Сам по себе аккаунт MAX не подтверждает выполнение этих условий; внутренние сроки ответа не заменяют сроки закона при его применимости.</w:t>
+      </w:r>
+    </w:p>
+    <w:p>
+      <w:pPr>
+        <w:spacing w:after="0" w:line="240" w:lineRule="auto"/>
+        <w:ind w:firstLine="709"/>
+        <w:jc w:val="both"/>
+      </w:pPr>
+      <w:r>
+        <w:rPr>
+          <w:rFonts w:ascii="Times New Roman" w:cs="Times New Roman" w:eastAsia="Times New Roman" w:hAnsi="Times New Roman"/>
+          <w:sz w:val="28"/>
+          <w:szCs w:val="28"/>
+        </w:rPr>
+        <w:t xml:space="preserve">6. Чат-бот не запрашивает биометрические данные и специальные категории персональных данных. Фотографии и видеозаписи не используются для установления личности по биометрическим признакам. Пользователю рекомендуется не направлять такие сведения. При их непреднамеренном поступлении сотрудник прекращает дальнейшее копирование и пересылку, ограничивает доступ и уведомляет ответственного за организацию обработки персональных данных. Ответственный проверяет наличие специального законного основания, организует блокирование и, при отсутствии основания, прекращение обработки и уничтожение во всех подконтрольных копиях. Обычное согласие нажатием кнопки не заменяет письменного согласия в случаях, предусмотренных статьями 10 и 11 Федерального закона № 152-ФЗ. Порядок действий и технические ограничения определяются внутренней инструкцией; автоматическое распознавание и удаление таких сведений не гарантируются.</w:t>
       </w:r>
     </w:p>
     <w:p>
@@ -401,7 +401,37 @@
           <w:sz w:val="28"/>
           <w:szCs w:val="28"/>
         </w:rPr>
-        <w:t xml:space="preserve">6) приложенные пользователем фотографии, видеозаписи и файлы.</w:t>
+        <w:t xml:space="preserve">6) приложенные пользователем фотографии, видеозаписи и файлы;</w:t>
+      </w:r>
+    </w:p>
+    <w:p>
+      <w:pPr>
+        <w:spacing w:after="0" w:line="240" w:lineRule="auto"/>
+        <w:ind w:firstLine="709"/>
+        <w:jc w:val="both"/>
+      </w:pPr>
+      <w:r>
+        <w:rPr>
+          <w:rFonts w:ascii="Times New Roman" w:cs="Times New Roman" w:eastAsia="Times New Roman" w:hAnsi="Times New Roman"/>
+          <w:sz w:val="28"/>
+          <w:szCs w:val="28"/>
+        </w:rPr>
+        <w:t xml:space="preserve">7) переписка по сообщению, ее даты и состояние доставки, дата и время согласия, сохраненный текст согласия;</w:t>
+      </w:r>
+    </w:p>
+    <w:p>
+      <w:pPr>
+        <w:spacing w:after="0" w:line="240" w:lineRule="auto"/>
+        <w:ind w:firstLine="709"/>
+        <w:jc w:val="both"/>
+      </w:pPr>
+      <w:r>
+        <w:rPr>
+          <w:rFonts w:ascii="Times New Roman" w:cs="Times New Roman" w:eastAsia="Times New Roman" w:hAnsi="Times New Roman"/>
+          <w:sz w:val="28"/>
+          <w:szCs w:val="28"/>
+        </w:rPr>
+        <w:t xml:space="preserve">8) временные сведения диалога и технического события. При добровольной передаче геолокации координаты используются для определения адреса; отсутствие отдельного поля координат в карточке не означает отсутствия их временной обработки в событии.</w:t>
       </w:r>
     </w:p>
     <w:p>
@@ -590,7 +620,7 @@
           <w:sz w:val="28"/>
           <w:szCs w:val="28"/>
         </w:rPr>
-        <w:t xml:space="preserve">16. При получении согласия Чат-бот фиксирует дату и время, идентификатор пользователя и текст, представленный для подтверждения. Если текст ранее данного согласия не сохранился, он не восстанавливается предположительно по действующей редакции. Обязанность доказать получение согласия лежит на Операторе (часть 3 статьи 9 Федерального закона № 152-ФЗ).</w:t>
+        <w:t xml:space="preserve">16. При получении согласия Чат-бот фиксирует дату и время, идентификатор пользователя и текст, представленный для подтверждения. Сохраняются также контрольная сумма редакции и связь с показанным запросом согласия. Если текст ранее данного согласия не сохранился, он не восстанавливается предположительно по действующей редакции; отсутствие текста указывается прямо. Обязанность доказать получение согласия лежит на Операторе (часть 3 статьи 9 Федерального закона № 152-ФЗ).</w:t>
       </w:r>
     </w:p>
     <w:p>
@@ -734,7 +764,7 @@
           <w:sz w:val="28"/>
           <w:szCs w:val="28"/>
         </w:rPr>
-        <w:t xml:space="preserve">3) автоматические процессы Чат-бота, выполняющие прием, передачу, доставку оповещений и архивирование.</w:t>
+        <w:t xml:space="preserve">3) автоматические процессы Чат-бота, выполняющие прием, передачу, доставку и очистку данных.</w:t>
       </w:r>
     </w:p>
     <w:p>
@@ -794,7 +824,7 @@
           <w:sz w:val="28"/>
           <w:szCs w:val="28"/>
         </w:rPr>
-        <w:t xml:space="preserve">1) случаев, прямо предусмотренных законодательством Российской Федерации (запросы уполномоченных органов); факт передачи фиксируется в журнале действий;</w:t>
+        <w:t xml:space="preserve">1) случаев, прямо предусмотренных законодательством Российской Федерации (запросы уполномоченных органов); факт передачи документируется ответственным сотрудником; автоматическая запись каждого такого действия Чат-ботом не гарантируется;</w:t>
       </w:r>
     </w:p>
     <w:p>
@@ -1037,7 +1067,7 @@
           <w:sz w:val="28"/>
           <w:szCs w:val="28"/>
         </w:rPr>
-        <w:t xml:space="preserve">35. Идентификатор пользователя используется для связи с аккаунтом MAX и доставки сообщений. При прекращении обработки Администрация организует уничтожение данных и их копий, находящихся под ее управлением, в соответствии с законодательством и внутренним порядком. Обработка данных мессенджером MAX осуществляется также по правилам его оператора. Состояние подписки и сведения о согласии на оповещения обрабатываются с учетом выбранного пользователем действия и применимых сроков.</w:t>
+        <w:t xml:space="preserve">35. Идентификатор пользователя используется для связи с аккаунтом MAX и доставки сообщений. Он является персональными данными, пока позволяет связать записи с определенным или определяемым человеком; замена имени идентификатором не является достаточным доказательством обезличивания. При прекращении обработки Администрация организует уничтожение данных и их копий, находящихся под ее управлением, в соответствии с законодательством и внутренним порядком. Обработка данных мессенджером MAX осуществляется также по правилам его оператора. Состояние подписки и сведения о согласии на оповещения обрабатываются с учетом выбранного пользователем действия и применимых сроков.</w:t>
       </w:r>
     </w:p>
     <w:p>
@@ -1112,7 +1142,7 @@
           <w:sz w:val="28"/>
           <w:szCs w:val="28"/>
         </w:rPr>
-        <w:t xml:space="preserve">3) в течение 10 рабочих дней с даты поступления требования пользователя о прекращении обработки (часть 5.1 статьи 21 Федерального закона № 152-ФЗ);</w:t>
+        <w:t xml:space="preserve">3) обработка по требованию пользователя прекращается в течение 10 рабочих дней с даты получения требования, кроме предусмотренных законом случаев; возможно мотивированное продление не более чем на 5 рабочих дней. Этот срок относится к прекращению обработки, а основание и срок уничтожения определяются отдельно (часть 5.1 статьи 21 Федерального закона № 152-ФЗ);</w:t>
       </w:r>
     </w:p>
     <w:p>
@@ -1142,7 +1172,7 @@
           <w:sz w:val="28"/>
           <w:szCs w:val="28"/>
         </w:rPr>
-        <w:t xml:space="preserve">38. При невозможности уничтожения в установленный срок данные блокируются и уничтожаются в срок не более 6 месяцев (часть 6 статьи 21 Федерального закона № 152-ФЗ).</w:t>
+        <w:t xml:space="preserve">38. При отсутствии возможности уничтожения в сроки, указанные в частях 3–5.1 статьи 21 Федерального закона № 152-ФЗ, данные блокируются и уничтожаются в срок не более 6 месяцев, если иной срок не установлен федеральными законами. Ротация резервных копий не заменяет блокирование и контроль исполнения этого срока.</w:t>
       </w:r>
     </w:p>
     <w:p>
@@ -1316,7 +1346,7 @@
           <w:sz w:val="28"/>
           <w:szCs w:val="28"/>
         </w:rPr>
-        <w:t xml:space="preserve">1) отзыв согласия – кнопкой «Отозвать согласие» в разделе «Уйти из бота» меню «Настройки и помощь»: направление оповещений прекращается, новые сообщения без нового согласия не принимаются. Дальнейшая обработка проверяется на наличие самостоятельного законного основания;</w:t>
+        <w:t xml:space="preserve">1) отзыв согласия – кнопкой «Отозвать согласие» в разделе «Уйти из бота» меню «Настройки и помощь»: направление оповещений прекращается, новые сообщения без нового согласия не принимаются. Ответы через Чат-бот после отзыва не отправляются. Уже поданные сообщения сохраняются до оценки ответственным лицом и очистки; при наличии самостоятельного основания дальнейшая работа организуется через официальный канал вне Чат-бота. Плановая очистка рабочей базы начинается с 29-го дня после отзыва и проверяется ежечасно; сбой сервиса не продлевает законный срок;</w:t>
       </w:r>
     </w:p>
     <w:p>

</xml_diff>

<commit_message>
docs: reconcile known-copy cleanup and resumed-case retention clock
</commit_message>
<xml_diff>
--- a/docs/Политика_конфиденциальности_ИС_Чат-бот_MAX.docx
+++ b/docs/Политика_конфиденциальности_ИС_Чат-бот_MAX.docx
@@ -1052,7 +1052,7 @@
           <w:sz w:val="28"/>
           <w:szCs w:val="28"/>
         </w:rPr>
-        <w:t xml:space="preserve">34. Для работы с сообщениями и оценки принятых мер установлен операционный ориентир хранения содержательной части пять лет. В рабочей базе срок отсчитывается от закрытия, при отсутствии закрытия – от ответа, а при отсутствии обоих – от подачи; если последнее сообщение переписки поступило позднее, срок отсчитывается от него. Пятилетний период не является универсальным сроком, установленным законом для всех данных Чат-бота: необходимость продолжения обработки, достижение цели и специальные сроки проверяются отдельно. По установленному правилу рабочая база очищает текст, адрес и сведения о вложениях; сведения, остающиеся для статистики, оцениваются на возможность повторной идентификации.</w:t>
+        <w:t xml:space="preserve">34. Для работы с сообщениями и оценки принятых мер установлен операционный ориентир хранения содержательной части пять лет. В рабочей базе срок отсчитывается от закрытия, при отсутствии закрытия – от ответа, а при отсутствии обоих – от подачи; позднейшее начало текущего периода работы при возобновлении, принятие нового сообщения в работу и более поздняя переписка сдвигают начало горизонта. Время принятия в работу учитывается отдельно и не переносит срок первого ответа. Пятилетний период не является универсальным сроком, установленным законом для всех данных Чат-бота: необходимость продолжения обработки, достижение цели и специальные сроки проверяются отдельно. По установленному правилу рабочая база очищает текст, адрес и сведения о вложениях; сведения, остающиеся для статистики, оцениваются на возможность повторной идентификации.</w:t>
       </w:r>
     </w:p>
     <w:p>
@@ -1361,7 +1361,7 @@
           <w:sz w:val="28"/>
           <w:szCs w:val="28"/>
         </w:rPr>
-        <w:t xml:space="preserve">2) запрос удаления данных – кнопкой «Удалить данные» в том же разделе: из рабочей базы удаляются запись пользователя, имя, телефон, содержимое сообщений, адреса и сохраненные сведения о вложениях, открытые сообщения закрываются. Действия в отношении иных копий и внешних систем выполняются по внутренней инструкции;</w:t>
+        <w:t xml:space="preserve">2) запрос удаления данных – кнопкой «Удалить данные» в том же разделе: из рабочей базы удаляются запись пользователя, имя, телефон, содержимое сообщений, адреса и сохраненные сведения о вложениях, открытые сообщения закрываются. для известных копий сообщений MAX создается очередь удаления с проверкой результата, запускается очистка распознанных локальных резервных копий и текущих объектов активного внешнего хранилища. Неизвестные исторические идентификаторы, скачанные файлы, копии платформы, версии внешних объектов, снимки и сторонние журналы проверяются отдельно по внутренней инструкции;</w:t>
       </w:r>
     </w:p>
     <w:p>

</xml_diff>